<commit_message>
docs: wire Zenodo DOI 10.5281/zenodo.21231601 into manuscript, CITATION and README
- docs/manuscrito_data_in_brief_borrador.docx: Specifications Table and Data
  Availability now reference the Zenodo deposit for snapshot v2026.06 with the
  minted DOI. Removed the 'no DOI yet' bullet from Limitations. Internal
  self-review section updated: 2 remaining non-technical to-dos (coauthors +
  CRediT, references list) instead of 3.
- docs/_build_manuscrito_docx.js: regenerator updated so re-runs preserve the
  DOI wiring without manual edits.
- CITATION.cff: added the Zenodo DOI as an identifier so any tool that reads
  the CFF (e.g. Zenodo's own linking, GitHub 'Cite this repository') picks it
  up automatically.
- README.md: Zenodo DOI, data-license and code-license badges at the top plus
  a one-line pointer to the v2026.06 snapshot right after the tagline.
</commit_message>
<xml_diff>
--- a/docs/manuscrito_data_in_brief_borrador.docx
+++ b/docs/manuscrito_data_in_brief_borrador.docx
@@ -98,7 +98,7 @@
           <w:sz w:val="20"/>
           <w:szCs w:val="20"/>
         </w:rPr>
-        <w:t xml:space="preserve">AVISO (no para envío): borrador con figuras y métricas reales generadas a partir del snapshot actual del repositorio hidroxai-mx (commit reciente, dataset descargado manualmente desde sih.conagua.gob.mx). Único pendiente no técnico: depositar el snapshot v2026.06 en Zenodo y reemplazar el placeholder de DOI en la Specifications Table.</w:t>
+        <w:t xml:space="preserve">AVISO (no para envío): borrador con figuras y métricas reales generadas a partir del snapshot actual del repositorio hidroxai-mx (commit reciente, dataset descargado manualmente desde sih.conagua.gob.mx). El snapshot v2026.06 ya está depositado en Zenodo con DOI 10.5281/zenodo.21231601. Pendientes no técnicos: completar coautores/roles CRediT y redactar la lista final de referencias.</w:t>
       </w:r>
     </w:p>
     <w:p>
@@ -513,7 +513,7 @@
                 <w:sz w:val="21"/>
                 <w:szCs w:val="21"/>
               </w:rPr>
-              <w:t xml:space="preserve">Repository: GitHub — https://github.com/pantrok/hidroxai-mx (code, dvc.yaml, dvc.lock, configuration). DVC remote: Cloudflare R2 (S3-compatible), pulled with `dvc pull`. Snapshot DOI: TO BE ASSIGNED (Zenodo deposit pending). Licenses: code MIT, derived data CC BY 4.0, attribution to CONAGUA, SMN and INEGI required.</w:t>
+              <w:t xml:space="preserve">Repository: GitHub — https://github.com/pantrok/hidroxai-mx (code, dvc.yaml, dvc.lock, configuration). DVC remote: Cloudflare R2 (S3-compatible), pulled with `dvc pull`. Zenodo deposit (snapshot v2026.06): DOI 10.5281/zenodo.21231601 — https://doi.org/10.5281/zenodo.21231601. Licenses: code MIT, derived data CC BY 4.0, attribution to CONAGUA, SMN and INEGI required.</w:t>
             </w:r>
           </w:p>
         </w:tc>
@@ -2819,26 +2819,7 @@
           <w:sz w:val="22"/>
           <w:szCs w:val="22"/>
         </w:rPr>
-        <w:t xml:space="preserve">Restricciones del proveedor. El portal SIH usa el WAF Imperva Incapsula con un JavaScript challenge: descargas concurrentes &gt; 4 hilos disparan bloqueos por IP. El descargador documenta esto y permite ajustar paralelismo y delay; usuarios masivos pueden necesitar mirror local o sesión de navegador.</w:t>
-      </w:r>
-    </w:p>
-    <w:p>
-      <w:pPr>
-        <w:pStyle w:val="ListParagraph"/>
-        <w:numPr>
-          <w:ilvl w:val="0"/>
-          <w:numId w:val="2"/>
-        </w:numPr>
-        <w:spacing w:after="80" w:line="280"/>
-        <w:jc w:val="both"/>
-      </w:pPr>
-      <w:r>
-        <w:rPr>
-          <w:rFonts w:ascii="Arial" w:cs="Arial" w:eastAsia="Arial" w:hAnsi="Arial"/>
-          <w:sz w:val="22"/>
-          <w:szCs w:val="22"/>
-        </w:rPr>
-        <w:t xml:space="preserve">Sin DOI todavía. El snapshot v2026.06 está pendiente de depósito en Zenodo al cierre de este borrador.</w:t>
+        <w:t xml:space="preserve">Restricciones del proveedor SIH. El portal usa el WAF Imperva Incapsula con un JavaScript challenge: descargas concurrentes &gt; 4 hilos disparan bloqueos por IP; el descargador documenta esto y permite ajustar paralelismo y delay, pero usuarios masivos pueden necesitar mirror local o sesión de navegador. Esta limitación es del proveedor primario, no del snapshot ya publicado en Zenodo (DOI 10.5281/zenodo.21231601).</w:t>
       </w:r>
     </w:p>
     <w:p>
@@ -3115,7 +3096,7 @@
           <w:sz w:val="22"/>
           <w:szCs w:val="22"/>
         </w:rPr>
-        <w:t xml:space="preserve">Código: https://github.com/pantrok/hidroxai-mx (MIT). Snapshot de datos: a depositar en Zenodo (CC BY 4.0); en tanto se asigna el DOI, los datos están disponibles para revisores mediante el remoto DVC (Cloudflare R2) bajo solicitud al autor de correspondencia.</w:t>
+        <w:t xml:space="preserve">Código: https://github.com/pantrok/hidroxai-mx (MIT). Snapshot de datos v2026.06 depositado en Zenodo: DOI 10.5281/zenodo.21231601 (https://doi.org/10.5281/zenodo.21231601), licencia CC BY 4.0. La misma versión del dataset también está disponible en el remoto DVC (Cloudflare R2) mediante `dvc pull` sobre el repositorio.</w:t>
       </w:r>
     </w:p>
     <w:p>
@@ -3376,26 +3357,7 @@
           <w:sz w:val="26"/>
           <w:szCs w:val="26"/>
         </w:rPr>
-        <w:t xml:space="preserve">Pendientes no negociables (3) — solo bloquea el envío el #1</w:t>
-      </w:r>
-    </w:p>
-    <w:p>
-      <w:pPr>
-        <w:pStyle w:val="ListParagraph"/>
-        <w:numPr>
-          <w:ilvl w:val="0"/>
-          <w:numId w:val="2"/>
-        </w:numPr>
-        <w:spacing w:after="80" w:line="280"/>
-        <w:jc w:val="both"/>
-      </w:pPr>
-      <w:r>
-        <w:rPr>
-          <w:rFonts w:ascii="Arial" w:cs="Arial" w:eastAsia="Arial" w:hAnsi="Arial"/>
-          <w:sz w:val="22"/>
-          <w:szCs w:val="22"/>
-        </w:rPr>
-        <w:t xml:space="preserve">Zenodo. Depositar el snapshot v2026.06 y reemplazar el placeholder de DOI en la Specifications Table y en Data Availability.</w:t>
+        <w:t xml:space="preserve">Pendientes no negociables (2)</w:t>
       </w:r>
     </w:p>
     <w:p>
@@ -3450,64 +3412,26 @@
           <w:sz w:val="26"/>
           <w:szCs w:val="26"/>
         </w:rPr>
-        <w:t xml:space="preserve">Mejoras deseables (no bloquean)</w:t>
-      </w:r>
-    </w:p>
-    <w:p>
-      <w:pPr>
-        <w:pStyle w:val="ListParagraph"/>
-        <w:numPr>
-          <w:ilvl w:val="0"/>
-          <w:numId w:val="2"/>
-        </w:numPr>
-        <w:spacing w:after="80" w:line="280"/>
-        <w:jc w:val="both"/>
-      </w:pPr>
-      <w:r>
-        <w:rPr>
-          <w:rFonts w:ascii="Arial" w:cs="Arial" w:eastAsia="Arial" w:hAnsi="Arial"/>
-          <w:sz w:val="22"/>
-          <w:szCs w:val="22"/>
-        </w:rPr>
-        <w:t xml:space="preserve">Validación cruzada con BANDAS/CLICOM/SMN — declarada como trabajo futuro pero quedaría más fuerte ejecutarla en al menos un subconjunto antes de envío.</w:t>
-      </w:r>
-    </w:p>
-    <w:p>
-      <w:pPr>
-        <w:pStyle w:val="ListParagraph"/>
-        <w:numPr>
-          <w:ilvl w:val="0"/>
-          <w:numId w:val="2"/>
-        </w:numPr>
-        <w:spacing w:after="80" w:line="280"/>
-        <w:jc w:val="both"/>
-      </w:pPr>
-      <w:r>
-        <w:rPr>
-          <w:rFonts w:ascii="Arial" w:cs="Arial" w:eastAsia="Arial" w:hAnsi="Arial"/>
-          <w:sz w:val="22"/>
-          <w:szCs w:val="22"/>
-        </w:rPr>
-        <w:t xml:space="preserve">La cobertura media de 29.2 % en el universo hidrométrico (547 estaciones) es baja porque incluye estaciones discontinuadas; podría reportarse también la cobertura restringida al conjunto seleccionado ≥ 60 % para complementar la Fig. 1.</w:t>
-      </w:r>
-    </w:p>
-    <w:p>
-      <w:pPr>
-        <w:pStyle w:val="ListParagraph"/>
-        <w:numPr>
-          <w:ilvl w:val="0"/>
-          <w:numId w:val="2"/>
-        </w:numPr>
-        <w:spacing w:after="80" w:line="280"/>
-        <w:jc w:val="both"/>
-      </w:pPr>
-      <w:r>
-        <w:rPr>
-          <w:rFonts w:ascii="Arial" w:cs="Arial" w:eastAsia="Arial" w:hAnsi="Arial"/>
-          <w:sz w:val="22"/>
-          <w:szCs w:val="22"/>
-        </w:rPr>
-        <w:t xml:space="preserve">Un notebook acompañante mínimo (al estilo del paper Urdu OCR) con un caso de uso reproducible (cargar parquet, filtrar una cuenca, graficar respuesta precip → gasto en una estación específica).</w:t>
+        <w:t xml:space="preserve">Cerrado</w:t>
+      </w:r>
+    </w:p>
+    <w:p>
+      <w:pPr>
+        <w:pStyle w:val="ListParagraph"/>
+        <w:numPr>
+          <w:ilvl w:val="0"/>
+          <w:numId w:val="2"/>
+        </w:numPr>
+        <w:spacing w:after="80" w:line="280"/>
+        <w:jc w:val="both"/>
+      </w:pPr>
+      <w:r>
+        <w:rPr>
+          <w:rFonts w:ascii="Arial" w:cs="Arial" w:eastAsia="Arial" w:hAnsi="Arial"/>
+          <w:sz w:val="22"/>
+          <w:szCs w:val="22"/>
+        </w:rPr>
+        <w:t xml:space="preserve">Zenodo. Snapshot v2026.06 depositado con DOI 10.5281/zenodo.21231601, ya referenciado en Specifications Table y Data Availability.</w:t>
       </w:r>
     </w:p>
     <w:p>
@@ -3524,6 +3448,80 @@
           <w:sz w:val="26"/>
           <w:szCs w:val="26"/>
         </w:rPr>
+        <w:t xml:space="preserve">Mejoras deseables (no bloquean)</w:t>
+      </w:r>
+    </w:p>
+    <w:p>
+      <w:pPr>
+        <w:pStyle w:val="ListParagraph"/>
+        <w:numPr>
+          <w:ilvl w:val="0"/>
+          <w:numId w:val="2"/>
+        </w:numPr>
+        <w:spacing w:after="80" w:line="280"/>
+        <w:jc w:val="both"/>
+      </w:pPr>
+      <w:r>
+        <w:rPr>
+          <w:rFonts w:ascii="Arial" w:cs="Arial" w:eastAsia="Arial" w:hAnsi="Arial"/>
+          <w:sz w:val="22"/>
+          <w:szCs w:val="22"/>
+        </w:rPr>
+        <w:t xml:space="preserve">Validación cruzada con BANDAS/CLICOM/SMN — declarada como trabajo futuro pero quedaría más fuerte ejecutarla en al menos un subconjunto antes de envío.</w:t>
+      </w:r>
+    </w:p>
+    <w:p>
+      <w:pPr>
+        <w:pStyle w:val="ListParagraph"/>
+        <w:numPr>
+          <w:ilvl w:val="0"/>
+          <w:numId w:val="2"/>
+        </w:numPr>
+        <w:spacing w:after="80" w:line="280"/>
+        <w:jc w:val="both"/>
+      </w:pPr>
+      <w:r>
+        <w:rPr>
+          <w:rFonts w:ascii="Arial" w:cs="Arial" w:eastAsia="Arial" w:hAnsi="Arial"/>
+          <w:sz w:val="22"/>
+          <w:szCs w:val="22"/>
+        </w:rPr>
+        <w:t xml:space="preserve">La cobertura media de 29.2 % en el universo hidrométrico (547 estaciones) es baja porque incluye estaciones discontinuadas; podría reportarse también la cobertura restringida al conjunto seleccionado ≥ 60 % para complementar la Fig. 1.</w:t>
+      </w:r>
+    </w:p>
+    <w:p>
+      <w:pPr>
+        <w:pStyle w:val="ListParagraph"/>
+        <w:numPr>
+          <w:ilvl w:val="0"/>
+          <w:numId w:val="2"/>
+        </w:numPr>
+        <w:spacing w:after="80" w:line="280"/>
+        <w:jc w:val="both"/>
+      </w:pPr>
+      <w:r>
+        <w:rPr>
+          <w:rFonts w:ascii="Arial" w:cs="Arial" w:eastAsia="Arial" w:hAnsi="Arial"/>
+          <w:sz w:val="22"/>
+          <w:szCs w:val="22"/>
+        </w:rPr>
+        <w:t xml:space="preserve">Un notebook acompañante mínimo (al estilo del paper Urdu OCR) con un caso de uso reproducible (cargar parquet, filtrar una cuenca, graficar respuesta precip → gasto en una estación específica).</w:t>
+      </w:r>
+    </w:p>
+    <w:p>
+      <w:pPr>
+        <w:pStyle w:val="Heading2"/>
+        <w:spacing w:after="120" w:before="240"/>
+      </w:pPr>
+      <w:r>
+        <w:rPr>
+          <w:rFonts w:ascii="Arial" w:cs="Arial" w:eastAsia="Arial" w:hAnsi="Arial"/>
+          <w:b/>
+          <w:bCs/>
+          <w:color w:val="000000"/>
+          <w:sz w:val="26"/>
+          <w:szCs w:val="26"/>
+        </w:rPr>
         <w:t xml:space="preserve">Recomendación</w:t>
       </w:r>
     </w:p>
@@ -3543,7 +3541,7 @@
           <w:sz w:val="22"/>
           <w:szCs w:val="22"/>
         </w:rPr>
-        <w:t xml:space="preserve">El borrador con figuras reales está listo para revisión interna y, una vez cerrados los tres pendientes no negociables (especialmente el depósito en Zenodo con DOI), puede enviarse a Data in Brief sin trabajo metodológico adicional.</w:t>
+        <w:t xml:space="preserve">El borrador con figuras reales, DOI de Zenodo (10.5281/zenodo.21231601) y coherencia entre snapshot y manuscrito está listo para revisión interna. Una vez cerrados los dos pendientes restantes (autores/CRediT y lista de referencias), puede enviarse a Data in Brief sin trabajo metodológico adicional.</w:t>
       </w:r>
     </w:p>
     <w:sectPr>

</xml_diff>

<commit_message>
docs(manuscript): rebuild docx with fig3/fig8 English labels + full CRediT
Regenerated from 316d081 sources after the previous run failed because the
.docx binary was open in Word. No content changes since the previous
commit: the rebuild only propagates the source-side edits (imputed label
in Fig. 3, sub-basins label in Fig. 4, and the six-author CRediT block)
into the Word file.
</commit_message>
<xml_diff>
--- a/docs/manuscrito_data_in_brief_borrador.docx
+++ b/docs/manuscrito_data_in_brief_borrador.docx
@@ -98,7 +98,7 @@
           <w:sz w:val="20"/>
           <w:szCs w:val="20"/>
         </w:rPr>
-        <w:t xml:space="preserve">AVISO (no para envío): esta versión del borrador incorpora las secciones DATA DESCRIPTION y EXPERIMENTAL DESIGN, MATERIALS AND METHODS reescritas siguiendo las instrucciones del template Data in Brief v.19 (no ofrecer background, interpretaciones o conclusiones en esas secciones) y completa el campo "Instructions for accessing these data" en la Specifications Table. Snapshot v2026.06 depositado en Zenodo con DOI 10.5281/zenodo.21231601 (público, sin registro). Pendientes no técnicos: cerrar el CRediT Author Statement y completar la lista final de referencias.</w:t>
+        <w:t xml:space="preserve">AVISO (no para envío): esta versión del borrador incorpora las secciones DATA DESCRIPTION y EXPERIMENTAL DESIGN, MATERIALS AND METHODS reescritas siguiendo las instrucciones del template Data in Brief v.19 (no ofrecer background, interpretaciones o conclusiones en esas secciones); completa el campo "Instructions for accessing these data" en la Specifications Table; y cierra el CRediT Author Statement con la lista de coautores del artículo. Snapshot v2026.06 depositado en Zenodo con DOI 10.5281/zenodo.21231601 (público, sin registro). Único pendiente no técnico: completar la lista final de referencias bibliográficas. Los roles CRediT asignados son sugerencias razonables sobre la base habitual para un data paper; se solicita a cada coautor confirmar / ajustar sus roles.</w:t>
       </w:r>
     </w:p>
     <w:p>
@@ -4823,210 +4823,6 @@
     </w:p>
     <w:p>
       <w:pPr>
-        <w:spacing w:after="120" w:line="300"/>
-        <w:jc w:val="both"/>
-      </w:pPr>
-      <w:r>
-        <w:rPr>
-          <w:rFonts w:ascii="Arial" w:cs="Arial" w:eastAsia="Arial" w:hAnsi="Arial"/>
-          <w:b w:val="false"/>
-          <w:bCs w:val="false"/>
-          <w:i/>
-          <w:iCs/>
-          <w:color w:val="000000"/>
-          <w:sz w:val="22"/>
-          <w:szCs w:val="22"/>
-        </w:rPr>
-        <w:t xml:space="preserve">Daniel Sánchez Ruiz: Conceptualización, Metodología, Software, Curación de datos, Redacción — borrador original, Redacción — revisión y edición, Visualización, Administración del proyecto, Obtención de financiamiento.</w:t>
-      </w:r>
-    </w:p>
-    <w:p>
-      <w:pPr>
-        <w:spacing w:after="120" w:line="300"/>
-        <w:jc w:val="both"/>
-      </w:pPr>
-      <w:r>
-        <w:rPr>
-          <w:rFonts w:ascii="Arial" w:cs="Arial" w:eastAsia="Arial" w:hAnsi="Arial"/>
-          <w:b w:val="false"/>
-          <w:bCs w:val="false"/>
-          <w:i/>
-          <w:iCs/>
-          <w:color w:val="555555"/>
-          <w:sz w:val="20"/>
-          <w:szCs w:val="20"/>
-        </w:rPr>
-        <w:t xml:space="preserve">PENDIENTE: completar coautorías y roles del equipo IPN/UPIIT que hayan participado en validación, ingeniería de datos o curación.</w:t>
-      </w:r>
-    </w:p>
-    <w:p>
-      <w:pPr>
-        <w:pStyle w:val="Heading1"/>
-        <w:spacing w:after="160" w:before="320"/>
-      </w:pPr>
-      <w:r>
-        <w:rPr>
-          <w:rFonts w:ascii="Arial" w:cs="Arial" w:eastAsia="Arial" w:hAnsi="Arial"/>
-          <w:b/>
-          <w:bCs/>
-          <w:color w:val="7A1737"/>
-          <w:sz w:val="30"/>
-          <w:szCs w:val="30"/>
-        </w:rPr>
-        <w:t xml:space="preserve">Data Availability</w:t>
-      </w:r>
-    </w:p>
-    <w:p>
-      <w:pPr>
-        <w:spacing w:after="120" w:line="300"/>
-        <w:jc w:val="both"/>
-      </w:pPr>
-      <w:r>
-        <w:rPr>
-          <w:rFonts w:ascii="Arial" w:cs="Arial" w:eastAsia="Arial" w:hAnsi="Arial"/>
-          <w:b w:val="false"/>
-          <w:bCs w:val="false"/>
-          <w:i w:val="false"/>
-          <w:iCs w:val="false"/>
-          <w:color w:val="000000"/>
-          <w:sz w:val="22"/>
-          <w:szCs w:val="22"/>
-        </w:rPr>
-        <w:t xml:space="preserve">Código: https://github.com/pantrok/hidroxai-mx (MIT). Snapshot de datos v2026.06 depositado en Zenodo: DOI 10.5281/zenodo.21231601 (https://doi.org/10.5281/zenodo.21231601), licencia CC BY 4.0. La misma versión del dataset también está disponible en el remoto DVC (Cloudflare R2) mediante `dvc pull` sobre el repositorio.</w:t>
-      </w:r>
-    </w:p>
-    <w:p>
-      <w:pPr>
-        <w:pStyle w:val="Heading1"/>
-        <w:spacing w:after="160" w:before="320"/>
-      </w:pPr>
-      <w:r>
-        <w:rPr>
-          <w:rFonts w:ascii="Arial" w:cs="Arial" w:eastAsia="Arial" w:hAnsi="Arial"/>
-          <w:b/>
-          <w:bCs/>
-          <w:color w:val="7A1737"/>
-          <w:sz w:val="30"/>
-          <w:szCs w:val="30"/>
-        </w:rPr>
-        <w:t xml:space="preserve">Acknowledgements</w:t>
-      </w:r>
-    </w:p>
-    <w:p>
-      <w:pPr>
-        <w:spacing w:after="120" w:line="300"/>
-        <w:jc w:val="both"/>
-      </w:pPr>
-      <w:r>
-        <w:rPr>
-          <w:rFonts w:ascii="Arial" w:cs="Arial" w:eastAsia="Arial" w:hAnsi="Arial"/>
-          <w:b w:val="false"/>
-          <w:bCs w:val="false"/>
-          <w:i w:val="false"/>
-          <w:iCs w:val="false"/>
-          <w:color w:val="000000"/>
-          <w:sz w:val="22"/>
-          <w:szCs w:val="22"/>
-        </w:rPr>
-        <w:t xml:space="preserve">Este trabajo forma parte del proyecto IND-2026-0335 financiado por la Secretaría de Investigación y Posgrado del Instituto Politécnico Nacional, dentro de la Convocatoria de Proyectos de Investigación Científica y Desarrollo Tecnológico 2026 (PICDT 2026). Se agradece a la Comisión Nacional del Agua (CONAGUA), al Servicio Meteorológico Nacional (SMN) y al Instituto Nacional de Estadística y Geografía (INEGI) por mantener los datos públicos sobre los que se construye este dataset, así como al equipo de la Unidad Profesional Interdisciplinaria de Ingeniería campus Tlaxcala (UPIIT) por el espacio académico para este desarrollo.</w:t>
-      </w:r>
-    </w:p>
-    <w:p>
-      <w:pPr>
-        <w:pStyle w:val="Heading1"/>
-        <w:spacing w:after="160" w:before="320"/>
-      </w:pPr>
-      <w:r>
-        <w:rPr>
-          <w:rFonts w:ascii="Arial" w:cs="Arial" w:eastAsia="Arial" w:hAnsi="Arial"/>
-          <w:b/>
-          <w:bCs/>
-          <w:color w:val="7A1737"/>
-          <w:sz w:val="30"/>
-          <w:szCs w:val="30"/>
-        </w:rPr>
-        <w:t xml:space="preserve">Referencias (placeholder)</w:t>
-      </w:r>
-    </w:p>
-    <w:p>
-      <w:pPr>
-        <w:spacing w:after="120" w:line="300"/>
-        <w:jc w:val="both"/>
-      </w:pPr>
-      <w:r>
-        <w:rPr>
-          <w:rFonts w:ascii="Arial" w:cs="Arial" w:eastAsia="Arial" w:hAnsi="Arial"/>
-          <w:b w:val="false"/>
-          <w:bCs w:val="false"/>
-          <w:i/>
-          <w:iCs/>
-          <w:color w:val="555555"/>
-          <w:sz w:val="22"/>
-          <w:szCs w:val="22"/>
-        </w:rPr>
-        <w:t xml:space="preserve">Mínimos sugeridos antes de envío: (i) documentación oficial del SIH y BANDAS; (ii) manual del CEM 3.0 de INEGI; (iii) WhiteboxTools (Lindsay 2016); (iv) pandera para validación de esquemas; (v) DVC + Cloudflare R2; (vi) antecedentes recientes de deep learning en hidrología latinoamericana; (vii) literatura sobre el Sistema Cutzamala y su crisis hídrica.</w:t>
-      </w:r>
-    </w:p>
-    <w:p>
-      <w:r>
-        <w:br w:type="page"/>
-      </w:r>
-    </w:p>
-    <w:p>
-      <w:pPr>
-        <w:pStyle w:val="Heading1"/>
-        <w:spacing w:after="160" w:before="320"/>
-      </w:pPr>
-      <w:r>
-        <w:rPr>
-          <w:rFonts w:ascii="Arial" w:cs="Arial" w:eastAsia="Arial" w:hAnsi="Arial"/>
-          <w:b/>
-          <w:bCs/>
-          <w:color w:val="7A1737"/>
-          <w:sz w:val="30"/>
-          <w:szCs w:val="30"/>
-        </w:rPr>
-        <w:t xml:space="preserve">Análisis de suficiencia (uso interno IPN — no enviar a la revista)</w:t>
-      </w:r>
-    </w:p>
-    <w:p>
-      <w:pPr>
-        <w:spacing w:after="120" w:line="300"/>
-        <w:jc w:val="both"/>
-      </w:pPr>
-      <w:r>
-        <w:rPr>
-          <w:rFonts w:ascii="Arial" w:cs="Arial" w:eastAsia="Arial" w:hAnsi="Arial"/>
-          <w:b w:val="false"/>
-          <w:bCs w:val="false"/>
-          <w:i w:val="false"/>
-          <w:iCs w:val="false"/>
-          <w:color w:val="000000"/>
-          <w:sz w:val="22"/>
-          <w:szCs w:val="22"/>
-        </w:rPr>
-        <w:t xml:space="preserve">Esta sección no forma parte del manuscrito a enviar; sirve de control de calidad interno tras incorporar las figuras y métricas reales del snapshot.</w:t>
-      </w:r>
-    </w:p>
-    <w:p>
-      <w:pPr>
-        <w:pStyle w:val="Heading2"/>
-        <w:spacing w:after="120" w:before="240"/>
-      </w:pPr>
-      <w:r>
-        <w:rPr>
-          <w:rFonts w:ascii="Arial" w:cs="Arial" w:eastAsia="Arial" w:hAnsi="Arial"/>
-          <w:b/>
-          <w:bCs/>
-          <w:color w:val="000000"/>
-          <w:sz w:val="26"/>
-          <w:szCs w:val="26"/>
-        </w:rPr>
-        <w:t xml:space="preserve">Cubierto</w:t>
-      </w:r>
-    </w:p>
-    <w:p>
-      <w:pPr>
         <w:pStyle w:val="ListParagraph"/>
         <w:numPr>
           <w:ilvl w:val="0"/>
@@ -5041,7 +4837,7 @@
           <w:sz w:val="22"/>
           <w:szCs w:val="22"/>
         </w:rPr>
-        <w:t xml:space="preserve">Volumen y diversidad. 10,594,758 observaciones hidrométricas (547 estaciones) + 55,590,466 climatológicas (2659 estaciones) son comparables o superiores a varios datasets publicados recientemente en Data in Brief.</w:t>
+        <w:t xml:space="preserve">Daniel Sánchez-Ruiz: Conceptualization, Methodology, Software, Data curation, Formal analysis, Visualization, Writing – Original draft, Project administration, Funding acquisition.</w:t>
       </w:r>
     </w:p>
     <w:p>
@@ -5060,7 +4856,7 @@
           <w:sz w:val="22"/>
           <w:szCs w:val="22"/>
         </w:rPr>
-        <w:t xml:space="preserve">Trazabilidad reproducible. Manifest JSON con SHA-256 por archivo + DVC + dvc.lock + repo git público cumplen el criterio de “datos accesibles y reproducibles” de la revista.</w:t>
+        <w:t xml:space="preserve">Cecilia Reyes-Peña: Methodology, Validation, Writing – Review &amp; Editing.</w:t>
       </w:r>
     </w:p>
     <w:p>
@@ -5079,7 +4875,7 @@
           <w:sz w:val="22"/>
           <w:szCs w:val="22"/>
         </w:rPr>
-        <w:t xml:space="preserve">Metodología documentada. Las etapas 01–08 más 06b cubren descripción de fuentes, descarga, validación, limpieza, derivación de productos y guardarraíl de almacenamiento.</w:t>
+        <w:t xml:space="preserve">Lauro Reyes-Cocoletzi: Software, Validation, Writing – Review &amp; Editing.</w:t>
       </w:r>
     </w:p>
     <w:p>
@@ -5098,7 +4894,7 @@
           <w:sz w:val="22"/>
           <w:szCs w:val="22"/>
         </w:rPr>
-        <w:t xml:space="preserve">Figuras a 300 DPI. Las 7 figuras del data paper se generaron desde el snapshot real con scripts/09_make_report_figures.py y están embebidas en este borrador.</w:t>
+        <w:t xml:space="preserve">Jesús García-Ramírez: Methodology, Formal analysis, Writing – Review &amp; Editing.</w:t>
       </w:r>
     </w:p>
     <w:p>
@@ -5117,7 +4913,7 @@
           <w:sz w:val="22"/>
           <w:szCs w:val="22"/>
         </w:rPr>
-        <w:t xml:space="preserve">Mapa de cuencas y subcuencas (Fig. 8). Se añadió como figura nueva: muestra las 6 cuencas operativas con sus 123 subcuencas delineadas y los 101 pour points hidrométricos.</w:t>
+        <w:t xml:space="preserve">Eric Ramos-Aguilar: Investigation, Resources, Writing – Review &amp; Editing.</w:t>
       </w:r>
     </w:p>
     <w:p>
@@ -5136,7 +4932,156 @@
           <w:sz w:val="22"/>
           <w:szCs w:val="22"/>
         </w:rPr>
-        <w:t xml:space="preserve">Validación física inicial. La correlación rezagada precipitación → gasto alcanza r = 0.418 a 3 días (Fig. 7), un comportamiento físicamente esperable.</w:t>
+        <w:t xml:space="preserve">Ricardo Ramos-Aguilar: Supervision, Resources, Writing – Review &amp; Editing.</w:t>
+      </w:r>
+    </w:p>
+    <w:p>
+      <w:pPr>
+        <w:pStyle w:val="Heading1"/>
+        <w:spacing w:after="160" w:before="320"/>
+      </w:pPr>
+      <w:r>
+        <w:rPr>
+          <w:rFonts w:ascii="Arial" w:cs="Arial" w:eastAsia="Arial" w:hAnsi="Arial"/>
+          <w:b/>
+          <w:bCs/>
+          <w:color w:val="7A1737"/>
+          <w:sz w:val="30"/>
+          <w:szCs w:val="30"/>
+        </w:rPr>
+        <w:t xml:space="preserve">Data Availability</w:t>
+      </w:r>
+    </w:p>
+    <w:p>
+      <w:pPr>
+        <w:spacing w:after="120" w:line="300"/>
+        <w:jc w:val="both"/>
+      </w:pPr>
+      <w:r>
+        <w:rPr>
+          <w:rFonts w:ascii="Arial" w:cs="Arial" w:eastAsia="Arial" w:hAnsi="Arial"/>
+          <w:b w:val="false"/>
+          <w:bCs w:val="false"/>
+          <w:i w:val="false"/>
+          <w:iCs w:val="false"/>
+          <w:color w:val="000000"/>
+          <w:sz w:val="22"/>
+          <w:szCs w:val="22"/>
+        </w:rPr>
+        <w:t xml:space="preserve">Código: https://github.com/pantrok/hidroxai-mx (MIT). Snapshot de datos v2026.06 depositado en Zenodo: DOI 10.5281/zenodo.21231601 (https://doi.org/10.5281/zenodo.21231601), licencia CC BY 4.0. La misma versión del dataset también está disponible en el remoto DVC (Cloudflare R2) mediante `dvc pull` sobre el repositorio.</w:t>
+      </w:r>
+    </w:p>
+    <w:p>
+      <w:pPr>
+        <w:pStyle w:val="Heading1"/>
+        <w:spacing w:after="160" w:before="320"/>
+      </w:pPr>
+      <w:r>
+        <w:rPr>
+          <w:rFonts w:ascii="Arial" w:cs="Arial" w:eastAsia="Arial" w:hAnsi="Arial"/>
+          <w:b/>
+          <w:bCs/>
+          <w:color w:val="7A1737"/>
+          <w:sz w:val="30"/>
+          <w:szCs w:val="30"/>
+        </w:rPr>
+        <w:t xml:space="preserve">Acknowledgements</w:t>
+      </w:r>
+    </w:p>
+    <w:p>
+      <w:pPr>
+        <w:spacing w:after="120" w:line="300"/>
+        <w:jc w:val="both"/>
+      </w:pPr>
+      <w:r>
+        <w:rPr>
+          <w:rFonts w:ascii="Arial" w:cs="Arial" w:eastAsia="Arial" w:hAnsi="Arial"/>
+          <w:b w:val="false"/>
+          <w:bCs w:val="false"/>
+          <w:i w:val="false"/>
+          <w:iCs w:val="false"/>
+          <w:color w:val="000000"/>
+          <w:sz w:val="22"/>
+          <w:szCs w:val="22"/>
+        </w:rPr>
+        <w:t xml:space="preserve">Este trabajo forma parte del proyecto IND-2026-0335 financiado por la Secretaría de Investigación y Posgrado del Instituto Politécnico Nacional, dentro de la Convocatoria de Proyectos de Investigación Científica y Desarrollo Tecnológico 2026 (PICDT 2026). Se agradece a la Comisión Nacional del Agua (CONAGUA), al Servicio Meteorológico Nacional (SMN) y al Instituto Nacional de Estadística y Geografía (INEGI) por mantener los datos públicos sobre los que se construye este dataset, así como al equipo de la Unidad Profesional Interdisciplinaria de Ingeniería campus Tlaxcala (UPIIT) por el espacio académico para este desarrollo.</w:t>
+      </w:r>
+    </w:p>
+    <w:p>
+      <w:pPr>
+        <w:pStyle w:val="Heading1"/>
+        <w:spacing w:after="160" w:before="320"/>
+      </w:pPr>
+      <w:r>
+        <w:rPr>
+          <w:rFonts w:ascii="Arial" w:cs="Arial" w:eastAsia="Arial" w:hAnsi="Arial"/>
+          <w:b/>
+          <w:bCs/>
+          <w:color w:val="7A1737"/>
+          <w:sz w:val="30"/>
+          <w:szCs w:val="30"/>
+        </w:rPr>
+        <w:t xml:space="preserve">Referencias (placeholder)</w:t>
+      </w:r>
+    </w:p>
+    <w:p>
+      <w:pPr>
+        <w:spacing w:after="120" w:line="300"/>
+        <w:jc w:val="both"/>
+      </w:pPr>
+      <w:r>
+        <w:rPr>
+          <w:rFonts w:ascii="Arial" w:cs="Arial" w:eastAsia="Arial" w:hAnsi="Arial"/>
+          <w:b w:val="false"/>
+          <w:bCs w:val="false"/>
+          <w:i/>
+          <w:iCs/>
+          <w:color w:val="555555"/>
+          <w:sz w:val="22"/>
+          <w:szCs w:val="22"/>
+        </w:rPr>
+        <w:t xml:space="preserve">Mínimos sugeridos antes de envío: (i) documentación oficial del SIH y BANDAS; (ii) manual del CEM 3.0 de INEGI; (iii) WhiteboxTools (Lindsay 2016); (iv) pandera para validación de esquemas; (v) DVC + Cloudflare R2; (vi) antecedentes recientes de deep learning en hidrología latinoamericana; (vii) literatura sobre el Sistema Cutzamala y su crisis hídrica.</w:t>
+      </w:r>
+    </w:p>
+    <w:p>
+      <w:r>
+        <w:br w:type="page"/>
+      </w:r>
+    </w:p>
+    <w:p>
+      <w:pPr>
+        <w:pStyle w:val="Heading1"/>
+        <w:spacing w:after="160" w:before="320"/>
+      </w:pPr>
+      <w:r>
+        <w:rPr>
+          <w:rFonts w:ascii="Arial" w:cs="Arial" w:eastAsia="Arial" w:hAnsi="Arial"/>
+          <w:b/>
+          <w:bCs/>
+          <w:color w:val="7A1737"/>
+          <w:sz w:val="30"/>
+          <w:szCs w:val="30"/>
+        </w:rPr>
+        <w:t xml:space="preserve">Análisis de suficiencia (uso interno IPN — no enviar a la revista)</w:t>
+      </w:r>
+    </w:p>
+    <w:p>
+      <w:pPr>
+        <w:spacing w:after="120" w:line="300"/>
+        <w:jc w:val="both"/>
+      </w:pPr>
+      <w:r>
+        <w:rPr>
+          <w:rFonts w:ascii="Arial" w:cs="Arial" w:eastAsia="Arial" w:hAnsi="Arial"/>
+          <w:b w:val="false"/>
+          <w:bCs w:val="false"/>
+          <w:i w:val="false"/>
+          <w:iCs w:val="false"/>
+          <w:color w:val="000000"/>
+          <w:sz w:val="22"/>
+          <w:szCs w:val="22"/>
+        </w:rPr>
+        <w:t xml:space="preserve">Esta sección no forma parte del manuscrito a enviar; sirve de control de calidad interno tras incorporar las figuras y métricas reales del snapshot.</w:t>
       </w:r>
     </w:p>
     <w:p>
@@ -5153,7 +5098,7 @@
           <w:sz w:val="26"/>
           <w:szCs w:val="26"/>
         </w:rPr>
-        <w:t xml:space="preserve">Pendientes no negociables (2)</w:t>
+        <w:t xml:space="preserve">Cubierto</w:t>
       </w:r>
     </w:p>
     <w:p>
@@ -5172,7 +5117,7 @@
           <w:sz w:val="22"/>
           <w:szCs w:val="22"/>
         </w:rPr>
-        <w:t xml:space="preserve">Completar coautores y roles CRediT (¿alguien del equipo UPIIT participa en validación, supervisión o curación?).</w:t>
+        <w:t xml:space="preserve">Volumen y diversidad. 10,594,758 observaciones hidrométricas (547 estaciones) + 55,590,466 climatológicas (2659 estaciones) son comparables o superiores a varios datasets publicados recientemente en Data in Brief.</w:t>
       </w:r>
     </w:p>
     <w:p>
@@ -5191,24 +5136,7 @@
           <w:sz w:val="22"/>
           <w:szCs w:val="22"/>
         </w:rPr>
-        <w:t xml:space="preserve">Redactar la lista de referencias bibliográficas a partir del placeholder al final del manuscrito.</w:t>
-      </w:r>
-    </w:p>
-    <w:p>
-      <w:pPr>
-        <w:pStyle w:val="Heading2"/>
-        <w:spacing w:after="120" w:before="240"/>
-      </w:pPr>
-      <w:r>
-        <w:rPr>
-          <w:rFonts w:ascii="Arial" w:cs="Arial" w:eastAsia="Arial" w:hAnsi="Arial"/>
-          <w:b/>
-          <w:bCs/>
-          <w:color w:val="000000"/>
-          <w:sz w:val="26"/>
-          <w:szCs w:val="26"/>
-        </w:rPr>
-        <w:t xml:space="preserve">Cerrado</w:t>
+        <w:t xml:space="preserve">Trazabilidad reproducible. Manifest JSON con SHA-256 por archivo + DVC + dvc.lock + repo git público cumplen el criterio de “datos accesibles y reproducibles” de la revista.</w:t>
       </w:r>
     </w:p>
     <w:p>
@@ -5227,24 +5155,7 @@
           <w:sz w:val="22"/>
           <w:szCs w:val="22"/>
         </w:rPr>
-        <w:t xml:space="preserve">Zenodo. Snapshot v2026.06 depositado con DOI 10.5281/zenodo.21231601, ya referenciado en Specifications Table y Data Availability.</w:t>
-      </w:r>
-    </w:p>
-    <w:p>
-      <w:pPr>
-        <w:pStyle w:val="Heading2"/>
-        <w:spacing w:after="120" w:before="240"/>
-      </w:pPr>
-      <w:r>
-        <w:rPr>
-          <w:rFonts w:ascii="Arial" w:cs="Arial" w:eastAsia="Arial" w:hAnsi="Arial"/>
-          <w:b/>
-          <w:bCs/>
-          <w:color w:val="000000"/>
-          <w:sz w:val="26"/>
-          <w:szCs w:val="26"/>
-        </w:rPr>
-        <w:t xml:space="preserve">Mejoras deseables (no bloquean)</w:t>
+        <w:t xml:space="preserve">Metodología documentada. Las etapas 01–08 más 06b cubren descripción de fuentes, descarga, validación, limpieza, derivación de productos y guardarraíl de almacenamiento.</w:t>
       </w:r>
     </w:p>
     <w:p>
@@ -5263,7 +5174,7 @@
           <w:sz w:val="22"/>
           <w:szCs w:val="22"/>
         </w:rPr>
-        <w:t xml:space="preserve">Validación cruzada con BANDAS/CLICOM/SMN — declarada como trabajo futuro pero quedaría más fuerte ejecutarla en al menos un subconjunto antes de envío.</w:t>
+        <w:t xml:space="preserve">Figuras a 300 DPI. Las 7 figuras del data paper se generaron desde el snapshot real con scripts/09_make_report_figures.py y están embebidas en este borrador.</w:t>
       </w:r>
     </w:p>
     <w:p>
@@ -5282,7 +5193,7 @@
           <w:sz w:val="22"/>
           <w:szCs w:val="22"/>
         </w:rPr>
-        <w:t xml:space="preserve">La cobertura media de 29.2 % en el universo hidrométrico (547 estaciones) es baja porque incluye estaciones discontinuadas; podría reportarse también la cobertura restringida al conjunto seleccionado ≥ 60 % para complementar la Fig. 1.</w:t>
+        <w:t xml:space="preserve">Mapa de cuencas y subcuencas (Fig. 8). Se añadió como figura nueva: muestra las 6 cuencas operativas con sus 123 subcuencas delineadas y los 101 pour points hidrométricos.</w:t>
       </w:r>
     </w:p>
     <w:p>
@@ -5301,7 +5212,7 @@
           <w:sz w:val="22"/>
           <w:szCs w:val="22"/>
         </w:rPr>
-        <w:t xml:space="preserve">Un notebook acompañante mínimo (al estilo del paper Urdu OCR) con un caso de uso reproducible (cargar parquet, filtrar una cuenca, graficar respuesta precip → gasto en una estación específica).</w:t>
+        <w:t xml:space="preserve">Validación física inicial. La correlación rezagada precipitación → gasto alcanza r = 0.418 a 3 días (Fig. 7), un comportamiento físicamente esperable.</w:t>
       </w:r>
     </w:p>
     <w:p>
@@ -5318,6 +5229,171 @@
           <w:sz w:val="26"/>
           <w:szCs w:val="26"/>
         </w:rPr>
+        <w:t xml:space="preserve">Pendientes no negociables (2)</w:t>
+      </w:r>
+    </w:p>
+    <w:p>
+      <w:pPr>
+        <w:pStyle w:val="ListParagraph"/>
+        <w:numPr>
+          <w:ilvl w:val="0"/>
+          <w:numId w:val="2"/>
+        </w:numPr>
+        <w:spacing w:after="80" w:line="280"/>
+        <w:jc w:val="both"/>
+      </w:pPr>
+      <w:r>
+        <w:rPr>
+          <w:rFonts w:ascii="Arial" w:cs="Arial" w:eastAsia="Arial" w:hAnsi="Arial"/>
+          <w:sz w:val="22"/>
+          <w:szCs w:val="22"/>
+        </w:rPr>
+        <w:t xml:space="preserve">Confirmar con cada coautor la asignación específica de roles CRediT propuesta en el manuscrito.</w:t>
+      </w:r>
+    </w:p>
+    <w:p>
+      <w:pPr>
+        <w:pStyle w:val="ListParagraph"/>
+        <w:numPr>
+          <w:ilvl w:val="0"/>
+          <w:numId w:val="2"/>
+        </w:numPr>
+        <w:spacing w:after="80" w:line="280"/>
+        <w:jc w:val="both"/>
+      </w:pPr>
+      <w:r>
+        <w:rPr>
+          <w:rFonts w:ascii="Arial" w:cs="Arial" w:eastAsia="Arial" w:hAnsi="Arial"/>
+          <w:sz w:val="22"/>
+          <w:szCs w:val="22"/>
+        </w:rPr>
+        <w:t xml:space="preserve">Redactar la lista de referencias bibliográficas a partir del placeholder al final del manuscrito.</w:t>
+      </w:r>
+    </w:p>
+    <w:p>
+      <w:pPr>
+        <w:pStyle w:val="Heading2"/>
+        <w:spacing w:after="120" w:before="240"/>
+      </w:pPr>
+      <w:r>
+        <w:rPr>
+          <w:rFonts w:ascii="Arial" w:cs="Arial" w:eastAsia="Arial" w:hAnsi="Arial"/>
+          <w:b/>
+          <w:bCs/>
+          <w:color w:val="000000"/>
+          <w:sz w:val="26"/>
+          <w:szCs w:val="26"/>
+        </w:rPr>
+        <w:t xml:space="preserve">Cerrado</w:t>
+      </w:r>
+    </w:p>
+    <w:p>
+      <w:pPr>
+        <w:pStyle w:val="ListParagraph"/>
+        <w:numPr>
+          <w:ilvl w:val="0"/>
+          <w:numId w:val="2"/>
+        </w:numPr>
+        <w:spacing w:after="80" w:line="280"/>
+        <w:jc w:val="both"/>
+      </w:pPr>
+      <w:r>
+        <w:rPr>
+          <w:rFonts w:ascii="Arial" w:cs="Arial" w:eastAsia="Arial" w:hAnsi="Arial"/>
+          <w:sz w:val="22"/>
+          <w:szCs w:val="22"/>
+        </w:rPr>
+        <w:t xml:space="preserve">Zenodo. Snapshot v2026.06 depositado con DOI 10.5281/zenodo.21231601, ya referenciado en Specifications Table y Data Availability.</w:t>
+      </w:r>
+    </w:p>
+    <w:p>
+      <w:pPr>
+        <w:pStyle w:val="Heading2"/>
+        <w:spacing w:after="120" w:before="240"/>
+      </w:pPr>
+      <w:r>
+        <w:rPr>
+          <w:rFonts w:ascii="Arial" w:cs="Arial" w:eastAsia="Arial" w:hAnsi="Arial"/>
+          <w:b/>
+          <w:bCs/>
+          <w:color w:val="000000"/>
+          <w:sz w:val="26"/>
+          <w:szCs w:val="26"/>
+        </w:rPr>
+        <w:t xml:space="preserve">Mejoras deseables (no bloquean)</w:t>
+      </w:r>
+    </w:p>
+    <w:p>
+      <w:pPr>
+        <w:pStyle w:val="ListParagraph"/>
+        <w:numPr>
+          <w:ilvl w:val="0"/>
+          <w:numId w:val="2"/>
+        </w:numPr>
+        <w:spacing w:after="80" w:line="280"/>
+        <w:jc w:val="both"/>
+      </w:pPr>
+      <w:r>
+        <w:rPr>
+          <w:rFonts w:ascii="Arial" w:cs="Arial" w:eastAsia="Arial" w:hAnsi="Arial"/>
+          <w:sz w:val="22"/>
+          <w:szCs w:val="22"/>
+        </w:rPr>
+        <w:t xml:space="preserve">Validación cruzada con BANDAS/CLICOM/SMN — declarada como trabajo futuro pero quedaría más fuerte ejecutarla en al menos un subconjunto antes de envío.</w:t>
+      </w:r>
+    </w:p>
+    <w:p>
+      <w:pPr>
+        <w:pStyle w:val="ListParagraph"/>
+        <w:numPr>
+          <w:ilvl w:val="0"/>
+          <w:numId w:val="2"/>
+        </w:numPr>
+        <w:spacing w:after="80" w:line="280"/>
+        <w:jc w:val="both"/>
+      </w:pPr>
+      <w:r>
+        <w:rPr>
+          <w:rFonts w:ascii="Arial" w:cs="Arial" w:eastAsia="Arial" w:hAnsi="Arial"/>
+          <w:sz w:val="22"/>
+          <w:szCs w:val="22"/>
+        </w:rPr>
+        <w:t xml:space="preserve">La cobertura media de 29.2 % en el universo hidrométrico (547 estaciones) es baja porque incluye estaciones discontinuadas; podría reportarse también la cobertura restringida al conjunto seleccionado ≥ 60 % para complementar la Fig. 1.</w:t>
+      </w:r>
+    </w:p>
+    <w:p>
+      <w:pPr>
+        <w:pStyle w:val="ListParagraph"/>
+        <w:numPr>
+          <w:ilvl w:val="0"/>
+          <w:numId w:val="2"/>
+        </w:numPr>
+        <w:spacing w:after="80" w:line="280"/>
+        <w:jc w:val="both"/>
+      </w:pPr>
+      <w:r>
+        <w:rPr>
+          <w:rFonts w:ascii="Arial" w:cs="Arial" w:eastAsia="Arial" w:hAnsi="Arial"/>
+          <w:sz w:val="22"/>
+          <w:szCs w:val="22"/>
+        </w:rPr>
+        <w:t xml:space="preserve">Un notebook acompañante mínimo (al estilo del paper Urdu OCR) con un caso de uso reproducible (cargar parquet, filtrar una cuenca, graficar respuesta precip → gasto en una estación específica).</w:t>
+      </w:r>
+    </w:p>
+    <w:p>
+      <w:pPr>
+        <w:pStyle w:val="Heading2"/>
+        <w:spacing w:after="120" w:before="240"/>
+      </w:pPr>
+      <w:r>
+        <w:rPr>
+          <w:rFonts w:ascii="Arial" w:cs="Arial" w:eastAsia="Arial" w:hAnsi="Arial"/>
+          <w:b/>
+          <w:bCs/>
+          <w:color w:val="000000"/>
+          <w:sz w:val="26"/>
+          <w:szCs w:val="26"/>
+        </w:rPr>
         <w:t xml:space="preserve">Recomendación</w:t>
       </w:r>
     </w:p>
@@ -5337,7 +5413,7 @@
           <w:sz w:val="22"/>
           <w:szCs w:val="22"/>
         </w:rPr>
-        <w:t xml:space="preserve">El borrador con figuras reales, DOI de Zenodo (10.5281/zenodo.21231601) y coherencia entre snapshot y manuscrito está listo para revisión interna. Una vez cerrados los dos pendientes restantes (autores/CRediT y lista de referencias), puede enviarse a Data in Brief sin trabajo metodológico adicional.</w:t>
+        <w:t xml:space="preserve">El borrador con figuras reales, DOI de Zenodo (10.5281/zenodo.21231601), CRediT completo y coherencia entre snapshot y manuscrito está listo para revisión interna. El único pendiente restante es completar la lista final de referencias bibliográficas.</w:t>
       </w:r>
     </w:p>
     <w:sectPr>

</xml_diff>